<commit_message>
[determinant] le coffacteur et le determinant de (2, 2)
</commit_message>
<xml_diff>
--- a/FORTRAN L1.docx
+++ b/FORTRAN L1.docx
@@ -386,6 +386,177 @@
     </w:p>
     <w:p>
       <w:pPr>
+        <w:pStyle w:val="3"/>
+        <w:bidi w:val="0"/>
+        <w:rPr>
+          <w:rFonts w:hint="default"/>
+          <w:lang w:val="en-US"/>
+        </w:rPr>
+      </w:pPr>
+      <w:r>
+        <w:rPr>
+          <w:rFonts w:hint="default"/>
+          <w:lang w:val="en-US"/>
+        </w:rPr>
+        <w:t>Installation de CodeBlock:</w:t>
+      </w:r>
+    </w:p>
+    <w:p>
+      <w:pPr>
+        <w:numPr>
+          <w:ilvl w:val="0"/>
+          <w:numId w:val="4"/>
+        </w:numPr>
+        <w:ind w:left="425" w:leftChars="0" w:hanging="425" w:firstLineChars="0"/>
+        <w:rPr>
+          <w:rFonts w:hint="default"/>
+          <w:lang w:val="en-US"/>
+        </w:rPr>
+      </w:pPr>
+      <w:r>
+        <w:rPr>
+          <w:rFonts w:hint="default"/>
+          <w:lang w:val="en-US"/>
+        </w:rPr>
+        <w:t>Executez CodeBlock installer:</w:t>
+      </w:r>
+    </w:p>
+    <w:p>
+      <w:pPr>
+        <w:widowControl w:val="0"/>
+        <w:numPr>
+          <w:numId w:val="0"/>
+        </w:numPr>
+        <w:jc w:val="both"/>
+        <w:rPr>
+          <w:rFonts w:hint="default"/>
+          <w:lang w:val="en-US"/>
+        </w:rPr>
+      </w:pPr>
+      <w:r>
+        <w:rPr>
+          <w:rFonts w:hint="default"/>
+          <w:lang w:val="en-US"/>
+        </w:rPr>
+        <w:t>NB: n’oubliez pas de desactiver votre antivirus.</w:t>
+      </w:r>
+    </w:p>
+    <w:p>
+      <w:pPr>
+        <w:widowControl w:val="0"/>
+        <w:numPr>
+          <w:numId w:val="0"/>
+        </w:numPr>
+        <w:jc w:val="both"/>
+      </w:pPr>
+    </w:p>
+    <w:p>
+      <w:pPr>
+        <w:widowControl w:val="0"/>
+        <w:numPr>
+          <w:numId w:val="0"/>
+        </w:numPr>
+        <w:jc w:val="both"/>
+      </w:pPr>
+      <w:r>
+        <w:drawing>
+          <wp:inline distT="0" distB="0" distL="114300" distR="114300">
+            <wp:extent cx="4752975" cy="3695700"/>
+            <wp:effectExtent l="0" t="0" r="9525" b="0"/>
+            <wp:docPr id="3" name="Image 3"/>
+            <wp:cNvGraphicFramePr>
+              <a:graphicFrameLocks xmlns:a="http://schemas.openxmlformats.org/drawingml/2006/main" noChangeAspect="1"/>
+            </wp:cNvGraphicFramePr>
+            <a:graphic xmlns:a="http://schemas.openxmlformats.org/drawingml/2006/main">
+              <a:graphicData uri="http://schemas.openxmlformats.org/drawingml/2006/picture">
+                <pic:pic xmlns:pic="http://schemas.openxmlformats.org/drawingml/2006/picture">
+                  <pic:nvPicPr>
+                    <pic:cNvPr id="3" name="Image 3"/>
+                    <pic:cNvPicPr>
+                      <a:picLocks noChangeAspect="1"/>
+                    </pic:cNvPicPr>
+                  </pic:nvPicPr>
+                  <pic:blipFill>
+                    <a:blip r:embed="rId6"/>
+                    <a:stretch>
+                      <a:fillRect/>
+                    </a:stretch>
+                  </pic:blipFill>
+                  <pic:spPr>
+                    <a:xfrm>
+                      <a:off x="0" y="0"/>
+                      <a:ext cx="4752975" cy="3695700"/>
+                    </a:xfrm>
+                    <a:prstGeom prst="rect">
+                      <a:avLst/>
+                    </a:prstGeom>
+                    <a:noFill/>
+                    <a:ln>
+                      <a:noFill/>
+                    </a:ln>
+                  </pic:spPr>
+                </pic:pic>
+              </a:graphicData>
+            </a:graphic>
+          </wp:inline>
+        </w:drawing>
+      </w:r>
+    </w:p>
+    <w:p>
+      <w:pPr>
+        <w:widowControl w:val="0"/>
+        <w:numPr>
+          <w:numId w:val="0"/>
+        </w:numPr>
+        <w:jc w:val="both"/>
+        <w:rPr>
+          <w:rFonts w:hint="default"/>
+          <w:b/>
+          <w:bCs/>
+          <w:lang w:val="en-US"/>
+        </w:rPr>
+      </w:pPr>
+      <w:r>
+        <w:rPr>
+          <w:rFonts w:hint="default"/>
+          <w:lang w:val="en-US"/>
+        </w:rPr>
+        <w:t xml:space="preserve">Appuyez sur </w:t>
+      </w:r>
+      <w:r>
+        <w:rPr>
+          <w:rFonts w:hint="default"/>
+          <w:b/>
+          <w:bCs/>
+          <w:lang w:val="en-US"/>
+        </w:rPr>
+        <w:t>next&gt;</w:t>
+      </w:r>
+    </w:p>
+    <w:p>
+      <w:pPr>
+        <w:widowControl w:val="0"/>
+        <w:numPr>
+          <w:numId w:val="0"/>
+        </w:numPr>
+        <w:jc w:val="both"/>
+        <w:rPr>
+          <w:rFonts w:hint="default"/>
+          <w:b/>
+          <w:bCs/>
+          <w:lang w:val="en-US"/>
+        </w:rPr>
+      </w:pPr>
+    </w:p>
+    <w:p>
+      <w:pPr>
+        <w:widowControl w:val="0"/>
+        <w:numPr>
+          <w:ilvl w:val="0"/>
+          <w:numId w:val="4"/>
+        </w:numPr>
+        <w:ind w:left="425" w:leftChars="0" w:hanging="425" w:firstLineChars="0"/>
+        <w:jc w:val="both"/>
         <w:rPr>
           <w:rFonts w:hint="default"/>
           <w:b w:val="0"/>
@@ -393,8 +564,344 @@
           <w:lang w:val="en-US"/>
         </w:rPr>
       </w:pPr>
+      <w:r>
+        <w:rPr>
+          <w:rFonts w:hint="default"/>
+          <w:b w:val="0"/>
+          <w:bCs w:val="0"/>
+          <w:lang w:val="en-US"/>
+        </w:rPr>
+        <w:t>Acceptez les conditions d’utilisation (lisez le si vous avez du temps a perdre)</w:t>
+      </w:r>
+    </w:p>
+    <w:p>
+      <w:pPr>
+        <w:widowControl w:val="0"/>
+        <w:numPr>
+          <w:numId w:val="0"/>
+        </w:numPr>
+        <w:jc w:val="both"/>
+      </w:pPr>
+      <w:r>
+        <w:drawing>
+          <wp:inline distT="0" distB="0" distL="114300" distR="114300">
+            <wp:extent cx="4752975" cy="3695700"/>
+            <wp:effectExtent l="0" t="0" r="9525" b="0"/>
+            <wp:docPr id="4" name="Image 4"/>
+            <wp:cNvGraphicFramePr>
+              <a:graphicFrameLocks xmlns:a="http://schemas.openxmlformats.org/drawingml/2006/main" noChangeAspect="1"/>
+            </wp:cNvGraphicFramePr>
+            <a:graphic xmlns:a="http://schemas.openxmlformats.org/drawingml/2006/main">
+              <a:graphicData uri="http://schemas.openxmlformats.org/drawingml/2006/picture">
+                <pic:pic xmlns:pic="http://schemas.openxmlformats.org/drawingml/2006/picture">
+                  <pic:nvPicPr>
+                    <pic:cNvPr id="4" name="Image 4"/>
+                    <pic:cNvPicPr>
+                      <a:picLocks noChangeAspect="1"/>
+                    </pic:cNvPicPr>
+                  </pic:nvPicPr>
+                  <pic:blipFill>
+                    <a:blip r:embed="rId7"/>
+                    <a:stretch>
+                      <a:fillRect/>
+                    </a:stretch>
+                  </pic:blipFill>
+                  <pic:spPr>
+                    <a:xfrm>
+                      <a:off x="0" y="0"/>
+                      <a:ext cx="4752975" cy="3695700"/>
+                    </a:xfrm>
+                    <a:prstGeom prst="rect">
+                      <a:avLst/>
+                    </a:prstGeom>
+                    <a:noFill/>
+                    <a:ln>
+                      <a:noFill/>
+                    </a:ln>
+                  </pic:spPr>
+                </pic:pic>
+              </a:graphicData>
+            </a:graphic>
+          </wp:inline>
+        </w:drawing>
+      </w:r>
+    </w:p>
+    <w:p>
+      <w:pPr>
+        <w:widowControl w:val="0"/>
+        <w:numPr>
+          <w:numId w:val="0"/>
+        </w:numPr>
+        <w:jc w:val="both"/>
+      </w:pPr>
+    </w:p>
+    <w:p>
+      <w:pPr>
+        <w:widowControl w:val="0"/>
+        <w:numPr>
+          <w:ilvl w:val="0"/>
+          <w:numId w:val="4"/>
+        </w:numPr>
+        <w:ind w:left="425" w:leftChars="0" w:hanging="425" w:firstLineChars="0"/>
+        <w:jc w:val="both"/>
+        <w:rPr>
+          <w:rFonts w:hint="default"/>
+          <w:b/>
+          <w:bCs/>
+          <w:lang w:val="en-US"/>
+        </w:rPr>
+      </w:pPr>
+      <w:r>
+        <w:rPr>
+          <w:rFonts w:hint="default"/>
+          <w:lang w:val="en-US"/>
+        </w:rPr>
+        <w:t xml:space="preserve">Appuyez sur </w:t>
+      </w:r>
+      <w:r>
+        <w:rPr>
+          <w:rFonts w:hint="default"/>
+          <w:b/>
+          <w:bCs/>
+          <w:lang w:val="en-US"/>
+        </w:rPr>
+        <w:t>next&gt;</w:t>
+      </w:r>
+    </w:p>
+    <w:p>
+      <w:pPr>
+        <w:widowControl w:val="0"/>
+        <w:numPr>
+          <w:numId w:val="0"/>
+        </w:numPr>
+        <w:ind w:leftChars="0"/>
+        <w:jc w:val="both"/>
+      </w:pPr>
+      <w:r>
+        <w:drawing>
+          <wp:inline distT="0" distB="0" distL="114300" distR="114300">
+            <wp:extent cx="4752975" cy="3695700"/>
+            <wp:effectExtent l="0" t="0" r="9525" b="0"/>
+            <wp:docPr id="5" name="Image 5"/>
+            <wp:cNvGraphicFramePr>
+              <a:graphicFrameLocks xmlns:a="http://schemas.openxmlformats.org/drawingml/2006/main" noChangeAspect="1"/>
+            </wp:cNvGraphicFramePr>
+            <a:graphic xmlns:a="http://schemas.openxmlformats.org/drawingml/2006/main">
+              <a:graphicData uri="http://schemas.openxmlformats.org/drawingml/2006/picture">
+                <pic:pic xmlns:pic="http://schemas.openxmlformats.org/drawingml/2006/picture">
+                  <pic:nvPicPr>
+                    <pic:cNvPr id="5" name="Image 5"/>
+                    <pic:cNvPicPr>
+                      <a:picLocks noChangeAspect="1"/>
+                    </pic:cNvPicPr>
+                  </pic:nvPicPr>
+                  <pic:blipFill>
+                    <a:blip r:embed="rId8"/>
+                    <a:stretch>
+                      <a:fillRect/>
+                    </a:stretch>
+                  </pic:blipFill>
+                  <pic:spPr>
+                    <a:xfrm>
+                      <a:off x="0" y="0"/>
+                      <a:ext cx="4752975" cy="3695700"/>
+                    </a:xfrm>
+                    <a:prstGeom prst="rect">
+                      <a:avLst/>
+                    </a:prstGeom>
+                    <a:noFill/>
+                    <a:ln>
+                      <a:noFill/>
+                    </a:ln>
+                  </pic:spPr>
+                </pic:pic>
+              </a:graphicData>
+            </a:graphic>
+          </wp:inline>
+        </w:drawing>
+      </w:r>
+    </w:p>
+    <w:p>
+      <w:pPr>
+        <w:widowControl w:val="0"/>
+        <w:numPr>
+          <w:numId w:val="0"/>
+        </w:numPr>
+        <w:ind w:leftChars="0"/>
+        <w:jc w:val="both"/>
+      </w:pPr>
+    </w:p>
+    <w:p>
+      <w:pPr>
+        <w:widowControl w:val="0"/>
+        <w:numPr>
+          <w:ilvl w:val="0"/>
+          <w:numId w:val="4"/>
+        </w:numPr>
+        <w:ind w:left="425" w:leftChars="0" w:hanging="425" w:firstLineChars="0"/>
+        <w:jc w:val="both"/>
+        <w:rPr>
+          <w:rFonts w:hint="default"/>
+          <w:lang w:val="en-US"/>
+        </w:rPr>
+      </w:pPr>
+      <w:r>
+        <w:rPr>
+          <w:rFonts w:hint="default"/>
+          <w:lang w:val="en-US"/>
+        </w:rPr>
+        <w:t>Lancez l’installation:</w:t>
+      </w:r>
+    </w:p>
+    <w:p>
+      <w:pPr>
+        <w:widowControl w:val="0"/>
+        <w:numPr>
+          <w:numId w:val="0"/>
+        </w:numPr>
+        <w:jc w:val="both"/>
+      </w:pPr>
+      <w:r>
+        <w:drawing>
+          <wp:inline distT="0" distB="0" distL="114300" distR="114300">
+            <wp:extent cx="4752975" cy="3695700"/>
+            <wp:effectExtent l="0" t="0" r="9525" b="0"/>
+            <wp:docPr id="6" name="Image 6"/>
+            <wp:cNvGraphicFramePr>
+              <a:graphicFrameLocks xmlns:a="http://schemas.openxmlformats.org/drawingml/2006/main" noChangeAspect="1"/>
+            </wp:cNvGraphicFramePr>
+            <a:graphic xmlns:a="http://schemas.openxmlformats.org/drawingml/2006/main">
+              <a:graphicData uri="http://schemas.openxmlformats.org/drawingml/2006/picture">
+                <pic:pic xmlns:pic="http://schemas.openxmlformats.org/drawingml/2006/picture">
+                  <pic:nvPicPr>
+                    <pic:cNvPr id="6" name="Image 6"/>
+                    <pic:cNvPicPr>
+                      <a:picLocks noChangeAspect="1"/>
+                    </pic:cNvPicPr>
+                  </pic:nvPicPr>
+                  <pic:blipFill>
+                    <a:blip r:embed="rId9"/>
+                    <a:stretch>
+                      <a:fillRect/>
+                    </a:stretch>
+                  </pic:blipFill>
+                  <pic:spPr>
+                    <a:xfrm>
+                      <a:off x="0" y="0"/>
+                      <a:ext cx="4752975" cy="3695700"/>
+                    </a:xfrm>
+                    <a:prstGeom prst="rect">
+                      <a:avLst/>
+                    </a:prstGeom>
+                    <a:noFill/>
+                    <a:ln>
+                      <a:noFill/>
+                    </a:ln>
+                  </pic:spPr>
+                </pic:pic>
+              </a:graphicData>
+            </a:graphic>
+          </wp:inline>
+        </w:drawing>
+      </w:r>
+    </w:p>
+    <w:p>
+      <w:pPr>
+        <w:widowControl w:val="0"/>
+        <w:numPr>
+          <w:ilvl w:val="0"/>
+          <w:numId w:val="4"/>
+        </w:numPr>
+        <w:ind w:left="425" w:leftChars="0" w:hanging="425" w:firstLineChars="0"/>
+        <w:jc w:val="both"/>
+        <w:rPr>
+          <w:rFonts w:hint="default"/>
+          <w:lang w:val="en-US"/>
+        </w:rPr>
+      </w:pPr>
+      <w:r>
+        <w:rPr>
+          <w:rFonts w:hint="default"/>
+          <w:lang w:val="en-US"/>
+        </w:rPr>
+        <w:t>Si tout se passe bien vous tomberez sur cette fenetre</w:t>
+      </w:r>
+    </w:p>
+    <w:p>
+      <w:pPr>
+        <w:widowControl w:val="0"/>
+        <w:numPr>
+          <w:numId w:val="0"/>
+        </w:numPr>
+        <w:jc w:val="both"/>
+      </w:pPr>
+      <w:r>
+        <w:drawing>
+          <wp:inline distT="0" distB="0" distL="114300" distR="114300">
+            <wp:extent cx="4752975" cy="3695700"/>
+            <wp:effectExtent l="0" t="0" r="9525" b="0"/>
+            <wp:docPr id="7" name="Image 7"/>
+            <wp:cNvGraphicFramePr>
+              <a:graphicFrameLocks xmlns:a="http://schemas.openxmlformats.org/drawingml/2006/main" noChangeAspect="1"/>
+            </wp:cNvGraphicFramePr>
+            <a:graphic xmlns:a="http://schemas.openxmlformats.org/drawingml/2006/main">
+              <a:graphicData uri="http://schemas.openxmlformats.org/drawingml/2006/picture">
+                <pic:pic xmlns:pic="http://schemas.openxmlformats.org/drawingml/2006/picture">
+                  <pic:nvPicPr>
+                    <pic:cNvPr id="7" name="Image 7"/>
+                    <pic:cNvPicPr>
+                      <a:picLocks noChangeAspect="1"/>
+                    </pic:cNvPicPr>
+                  </pic:nvPicPr>
+                  <pic:blipFill>
+                    <a:blip r:embed="rId10"/>
+                    <a:stretch>
+                      <a:fillRect/>
+                    </a:stretch>
+                  </pic:blipFill>
+                  <pic:spPr>
+                    <a:xfrm>
+                      <a:off x="0" y="0"/>
+                      <a:ext cx="4752975" cy="3695700"/>
+                    </a:xfrm>
+                    <a:prstGeom prst="rect">
+                      <a:avLst/>
+                    </a:prstGeom>
+                    <a:noFill/>
+                    <a:ln>
+                      <a:noFill/>
+                    </a:ln>
+                  </pic:spPr>
+                </pic:pic>
+              </a:graphicData>
+            </a:graphic>
+          </wp:inline>
+        </w:drawing>
+      </w:r>
       <w:bookmarkStart w:id="0" w:name="_GoBack"/>
       <w:bookmarkEnd w:id="0"/>
+    </w:p>
+    <w:p>
+      <w:pPr>
+        <w:widowControl w:val="0"/>
+        <w:numPr>
+          <w:numId w:val="0"/>
+        </w:numPr>
+        <w:jc w:val="both"/>
+      </w:pPr>
+    </w:p>
+    <w:p>
+      <w:pPr>
+        <w:widowControl w:val="0"/>
+        <w:numPr>
+          <w:numId w:val="0"/>
+        </w:numPr>
+        <w:jc w:val="both"/>
+        <w:rPr>
+          <w:rFonts w:hint="default"/>
+          <w:lang w:val="en-US"/>
+        </w:rPr>
+      </w:pPr>
     </w:p>
     <w:sectPr>
       <w:pgSz w:w="11906" w:h="16838"/>
@@ -468,6 +975,26 @@
       </w:rPr>
     </w:lvl>
   </w:abstractNum>
+  <w:abstractNum w:abstractNumId="3">
+    <w:nsid w:val="50A55ADE"/>
+    <w:multiLevelType w:val="singleLevel"/>
+    <w:tmpl w:val="50A55ADE"/>
+    <w:lvl w:ilvl="0" w:tentative="0">
+      <w:start w:val="1"/>
+      <w:numFmt w:val="decimal"/>
+      <w:lvlText w:val="%1."/>
+      <w:lvlJc w:val="left"/>
+      <w:pPr>
+        <w:tabs>
+          <w:tab w:val="left" w:pos="425"/>
+        </w:tabs>
+        <w:ind w:left="425" w:leftChars="0" w:hanging="425" w:firstLineChars="0"/>
+      </w:pPr>
+      <w:rPr>
+        <w:rFonts w:hint="default"/>
+      </w:rPr>
+    </w:lvl>
+  </w:abstractNum>
   <w:num w:numId="1">
     <w:abstractNumId w:val="2"/>
   </w:num>
@@ -476,6 +1003,9 @@
   </w:num>
   <w:num w:numId="3">
     <w:abstractNumId w:val="0"/>
+  </w:num>
+  <w:num w:numId="4">
+    <w:abstractNumId w:val="3"/>
   </w:num>
 </w:numbering>
 </file>

</xml_diff>